<commit_message>
docs: clean class diagram layout, use enum label, remove subtitle
Co-authored-by: Cursor <cursoragent@cursor.com>
</commit_message>
<xml_diff>
--- a/docs/NoteKeeper_Phase1_Proposal.docx
+++ b/docs/NoteKeeper_Phase1_Proposal.docx
@@ -3509,7 +3509,7 @@
       <w:r>
         <w:drawing>
           <wp:inline xmlns:a="http://schemas.openxmlformats.org/drawingml/2006/main" xmlns:pic="http://schemas.openxmlformats.org/drawingml/2006/picture">
-            <wp:extent cx="5943600" cy="3962400"/>
+            <wp:extent cx="5943600" cy="3625596"/>
             <wp:docPr id="1" name="Picture 1"/>
             <wp:cNvGraphicFramePr>
               <a:graphicFrameLocks noChangeAspect="1"/>
@@ -3518,11 +3518,11 @@
               <a:graphicData uri="http://schemas.openxmlformats.org/drawingml/2006/picture">
                 <pic:pic>
                   <pic:nvPicPr>
-                    <pic:cNvPr id="0" name="image.png"/>
+                    <pic:cNvPr id="0" name="class-diagram.png"/>
                     <pic:cNvPicPr/>
                   </pic:nvPicPr>
                   <pic:blipFill>
-                    <a:blip r:embed="rId10"/>
+                    <a:blip r:embed="rId11"/>
                     <a:stretch>
                       <a:fillRect/>
                     </a:stretch>
@@ -3530,7 +3530,7 @@
                   <pic:spPr>
                     <a:xfrm>
                       <a:off x="0" y="0"/>
-                      <a:ext cx="5943600" cy="3962400"/>
+                      <a:ext cx="5943600" cy="3625596"/>
                     </a:xfrm>
                     <a:prstGeom prst="rect"/>
                   </pic:spPr>
@@ -3551,16 +3551,7 @@
           <w:color w:val="6B7280"/>
           <w:sz w:val="20"/>
         </w:rPr>
-        <w:t>Figure 1. NoteKeeper domain class diagram (full system).</w:t>
-      </w:r>
-    </w:p>
-    <w:p>
-      <w:r>
-        <w:rPr>
-          <w:rFonts w:ascii="Calibri" w:hAnsi="Calibri"/>
-          <w:sz w:val="22"/>
-        </w:rPr>
-        <w:t>Names match the full domain model. Phase-1 implements Tag and Workspace in the JSF prototype.</w:t>
+        <w:t>Figure 1. NoteKeeper domain class diagram.</w:t>
       </w:r>
     </w:p>
     <w:p>

</xml_diff>

<commit_message>
docs: center diagram title, fix connectors, add scales legend
Co-authored-by: Cursor <cursoragent@cursor.com>
</commit_message>
<xml_diff>
--- a/docs/NoteKeeper_Phase1_Proposal.docx
+++ b/docs/NoteKeeper_Phase1_Proposal.docx
@@ -3509,7 +3509,7 @@
       <w:r>
         <w:drawing>
           <wp:inline xmlns:a="http://schemas.openxmlformats.org/drawingml/2006/main" xmlns:pic="http://schemas.openxmlformats.org/drawingml/2006/picture">
-            <wp:extent cx="5943600" cy="3625596"/>
+            <wp:extent cx="5943600" cy="3803904"/>
             <wp:docPr id="1" name="Picture 1"/>
             <wp:cNvGraphicFramePr>
               <a:graphicFrameLocks noChangeAspect="1"/>
@@ -3522,7 +3522,7 @@
                     <pic:cNvPicPr/>
                   </pic:nvPicPr>
                   <pic:blipFill>
-                    <a:blip r:embed="rId11"/>
+                    <a:blip r:embed="rId12"/>
                     <a:stretch>
                       <a:fillRect/>
                     </a:stretch>
@@ -3530,7 +3530,7 @@
                   <pic:spPr>
                     <a:xfrm>
                       <a:off x="0" y="0"/>
-                      <a:ext cx="5943600" cy="3625596"/>
+                      <a:ext cx="5943600" cy="3803904"/>
                     </a:xfrm>
                     <a:prstGeom prst="rect"/>
                   </pic:spPr>

</xml_diff>